<commit_message>
Add Nơi thường trú and Tên giới đàn fields; fill them in import and Word trình ký
Co-Authored-By: Claude Opus 5.5 <noreply@anthropic.com>
</commit_message>
<xml_diff>
--- a/resources/templates/trinh-ky.docx
+++ b/resources/templates/trinh-ky.docx
@@ -1421,6 +1421,23 @@
           <w:szCs w:val="30"/>
           <w:lang w:val="vi-VN"/>
         </w:rPr>
+        <w:fldChar w:fldCharType="separate"/>
+      </w:r>
+      <w:r>
+        <w:rPr>
+          <w:noProof/>
+          <w:sz w:val="30"/>
+          <w:szCs w:val="30"/>
+          <w:lang w:val="vi-VN"/>
+        </w:rPr>
+        <w:t>${gioidan}</w:t>
+      </w:r>
+      <w:r>
+        <w:rPr>
+          <w:sz w:val="30"/>
+          <w:szCs w:val="30"/>
+          <w:lang w:val="vi-VN"/>
+        </w:rPr>
         <w:fldChar w:fldCharType="end"/>
       </w:r>
     </w:p>
@@ -1478,7 +1495,7 @@
           <w:szCs w:val="30"/>
           <w:lang w:val="vi-VN"/>
         </w:rPr>
-        <w:t>${gioidan}</w:t>
+        <w:t>${noigioidan}</w:t>
       </w:r>
       <w:r>
         <w:rPr>
@@ -1635,7 +1652,7 @@
           <w:szCs w:val="30"/>
           <w:lang w:val="vi-VN"/>
         </w:rPr>
-        <w:t>${diachi}</w:t>
+        <w:t>${thuongtru}</w:t>
       </w:r>
       <w:r>
         <w:rPr>

</xml_diff>